<commit_message>
BBQ EN: ronda de la revisión final regenerada (4 entregables), gates G1-G9 VERDE, F2-NOTAS §9 y sha256 de §8
Ninguna cifra del caso cambia (solo el texto de consumibles_pct, 4% → 3.5%); landing con «the example in the
Word plan» (comillas simples del TS; esbuild OK).

Co-Authored-By: Claude Opus 5.5 <noreply@anthropic.com>
Via: Claude Code
</commit_message>
<xml_diff>
--- a/astro-site/public/dl/bbq-catering-business-plan/bbq-catering-business-plan.docx
+++ b/astro-site/public/dl/bbq-catering-business-plan/bbq-catering-business-plan.docx
@@ -325,7 +325,7 @@
     </w:p>
     <w:p>
       <w:r>
-        <w:t>The total startup investment is $135,671: $83,300 in startup costs plus $52,371 of working capital. The heaviest lines are the smoker trailer ($20,000), the used cargo van ($18,000), the holding and service equipment ($6,500), the live-fire rig ($4,500) and the launch budget. We do not build or lease a restaurant, which keeps the investment well below a venue with its own dining room and kitchen. The cash needed at opening is $135,671. We cover it with $35,000 of owner equity (26% of the total) and a $101,000 loan at 10.0% over 7 years. A loan of that size does not fit the $50,000 SBA Microloan cap, so the realistic routes are a bank loan or an SBA 7(a) loan, and no plan can promise a lender's answer.</w:t>
+        <w:t>The total startup investment is $135,671: $83,300 in startup costs plus $52,371 of working capital. The heaviest lines are the smoker trailer ($20,000), the used cargo van ($18,000), the holding and service equipment ($6,500), the launch budget ($5,000) and the live-fire rig ($4,500). We do not build or lease a restaurant, which keeps the investment well below a venue with its own dining room and kitchen. We cover it with $35,000 of owner equity (26% of the total) and a $101,000 loan at 10.0% over 7 years. A loan of that size does not fit the $50,000 SBA Microloan cap, so the realistic routes are a bank loan or an SBA 7(a) loan, and no plan can promise a lender's answer.</w:t>
       </w:r>
     </w:p>
     <w:p>
@@ -335,7 +335,7 @@
     </w:p>
     <w:p>
       <w:r>
-        <w:t>The founding team is short. The owner is the pitmaster, who also sells and buys. A pit cook or lead cook runs the second shift at the smoker, event staff (servers, buffet attendants and carvers) work event by event, and a prep cook doubles as the van driver. Everyone except the owner is a part-time hourly W-2 employee. That makes 9 people, or 2.85 full-time equivalents. Replace this paragraph with your own background: a lender wants to see who has run a pit and who has sold events. The plan shows that a BBQ caterer can start without a restaurant and with controlled risk, as long as every event is quoted, deposited and staffed on purpose.</w:t>
+        <w:t>The founding team is small. The owner is the pitmaster, who also sells and buys. A pit cook or lead cook runs the second shift at the smoker, event staff (servers, buffet attendants and carvers) work event by event, and a prep cook doubles as the van driver. Everyone except the owner is a part-time hourly W-2 employee. That makes 9 people, or 2.85 full-time equivalents. Replace this paragraph with your own background: a lender wants to see who has run a pit and who has sold events. The plan shows that a BBQ caterer can start without a restaurant and with controlled risk, as long as every event is quoted, deposited and staffed on purpose.</w:t>
       </w:r>
     </w:p>
     <w:p>
@@ -372,7 +372,7 @@
     </w:p>
     <w:p>
       <w:r>
-        <w:t>We compete against four alternatives. BBQ restaurants that cater on the side have a name, but their pit and crew serve the dining room first. General caterers put barbecue on the menu as one more dish and rarely cook with a pitmaster in front of the guests. Grocery and big-box trays win on price for small orders and lose on service. BBQ food trucks sell a different product, a quick line at a brewery or a lot, so we do not compete with them on speed. We place ourselves in the gap: smoked meat done right, live fire for the events that pay for it, and one person responsible for the event from the quote to the pack-down. We compete on the experience, not on the cheapest tray.</w:t>
+        <w:t>We compete against four alternatives. BBQ restaurants that cater on the side have a name, but their pit and crew serve the dining room first. General caterers put barbecue on the menu as one more dish and rarely cook with a pitmaster in front of the guests. Grocery and big-box trays win on price for small orders and lose on service. BBQ food trucks sell a different product, a quick line at a brewery or a lot, so we do not compete with them on speed. We place ourselves in the gap: smoked meat done right, live fire for the events that pay for it, and one person responsible for the event from the quote to the cleanup. We compete on the experience, not on the cheapest tray.</w:t>
       </w:r>
     </w:p>
     <w:p>
@@ -451,7 +451,7 @@
     </w:p>
     <w:p>
       <w:r>
-        <w:t>Porter's five forces look like this for a BBQ caterer. Supplier power is low to moderate: many meat purveyors, wood and charcoal sellers and equipment dealers compete for your order, although brisket prices swing and a single packer can raise your costs. Buyer power is moderate: clients compare quotes and reviews, but a good tasting and a clear proposal build loyalty, and large corporate accounts push harder on price. The threat of substitutes is real: a BBQ restaurant's catering menu, a grocery tray or a friend with a backyard smoker can replace you on a lower budget. Rivalry peaks in May, June and October, when everyone chases the same Saturdays. The threat of new entrants is moderate: a smoker is easy to buy, but a permitted commissary, insurance that covers the trailer and a fire, a propane backup and the cash for a van take planning, and that slows the hobbyists.</w:t>
+        <w:t>Porter's five forces look like this for a BBQ caterer. Supplier power is low to moderate: many meat purveyors, wood and charcoal sellers and equipment dealers compete for your order, although brisket prices swing and a single meatpacker can raise your costs. Buyer power is moderate: clients compare quotes and reviews, but a good tasting and a clear proposal build loyalty, and large corporate accounts push harder on price. The threat of substitutes is real: a BBQ restaurant's catering menu, a grocery tray or a friend with a backyard smoker can replace you on a lower budget. Rivalry peaks in May, June and October, when everyone chases the same Saturdays. The threat of new entrants is moderate: a smoker is easy to buy, but a permitted commissary, insurance that covers the trailer and a fire, a propane backup and the cash for a van take planning, and that slows the hobbyists.</w:t>
       </w:r>
     </w:p>
     <w:p>
@@ -555,7 +555,7 @@
     </w:p>
     <w:p>
       <w:r>
-        <w:t>Every event follows the same six phases, from the quote to the final payment. One, the briefing, about three weeks out, where we confirm the menu style, the guest count, the timeline and the allergies. Two, a venue visit about two weeks out to decide where the trailer or the rig goes, which way the smoke will blow, where water and power are and how far the carving station sits from the buffet. Three, ordering the meat five to seven days ahead. Four, rubs, trimming and portioning in the commissary. Five, the overnight cook: the calculator gives a "Start the pit by" time for the service time you quote, and the pitmaster cooks to the probe, not the clock. Six, resting and hot holding, loading, setup in 60 to 90 minutes, service from the buffet and carving station, then pack-down, cold ash in a metal can and the final invoice with any add-ons. Write the times down for every event; that log is your best defense if a guest ever complains.</w:t>
+        <w:t>Every event follows the same six phases, from the quote to the final payment. One, the final planning call with the client, about three weeks out, where we confirm the menu style, the guest count, the timeline and the allergies. Two, a venue visit about two weeks out to decide where the trailer or the rig goes, which way the smoke will blow, where water and power are and how far the carving station sits from the buffet. Three, ordering the meat five to seven days ahead. Four, rubs, trimming and portioning in the commissary. Five, the overnight cook: the calculator gives a "Start the pit by" time for the service time you quote, and the pitmaster cooks to the probe, not the clock. Six, resting and hot holding, loading, setup in 60 to 90 minutes, service from the buffet and carving station, then breakdown, cold ash in a metal can and the final invoice with any add-ons. Write the times down for every event; that log is your best defense if a guest ever complains.</w:t>
       </w:r>
     </w:p>
     <w:p>
@@ -565,7 +565,7 @@
     </w:p>
     <w:p>
       <w:r>
-        <w:t>We buy meat from an approved source, which means a USDA-inspected or state-inspected plant, and we keep the invoices. Packer briskets, pork butts and ribs come from a meat purveyor or a cash-and-carry such as Restaurant Depot, whichever gives the better price and the steadier grade; we ask for the same cut and weight every week so the cook times repeat. Wood is a second supply line: post oak in Texas, hickory, and red oak for Santa Maria, plus charcoal and a small stock of pellets. Sides, bread and sauces come from the commissary or a local vendor, and a party rental company covers the tables, linens and chafing fuel we do not own. Keep a maintenance calendar for the smoker, the trailer and the van: grease and ash out after every cook, and tires, brakes, lights and hitch checked before the season.</w:t>
+        <w:t>We buy meat from an approved source, which means a USDA-inspected or state-inspected plant, and we keep the invoices. Packer briskets, pork butts and ribs come from a meat purveyor or a cash-and-carry such as Restaurant Depot, whichever gives the better price and the steadier grade; we ask for the same cut and weight every week so the cook times repeat. Wood is a second supply line: post oak in Texas, hickory, and red oak for Santa Maria, plus charcoal and a small stock of pellets. Sides, bread and sauces come from the commissary or a local vendor, and a party rental company covers the tables, linens and any chafing dishes we do not own. Keep a maintenance calendar for the smoker, the trailer and the van: grease and ash out after every cook, and tires, brakes, lights and hitch checked before the season.</w:t>
       </w:r>
     </w:p>
     <w:p>
@@ -602,7 +602,7 @@
     </w:p>
     <w:p>
       <w:r>
-        <w:t>Everyone but the owner is a W-2 employee. Event staff work under our direction, on our schedule and with our equipment, which is the profile the Fair Labor Standards Act treats as employment, and California's AB5 presumes it. Calling them contractors may look cheaper, but misclassification can bring back taxes, penalties and claims, and it can sink a loan application. Payroll taxes add 10% to wages in the model, workers' compensation is required in nearly every state, and you pay at least the highest of the federal, state and local minimum wage; the workbook uses the federal floor of $15,080 for full-time work as its reference, and many states are higher. For wages, the Bureau of Labor Statistics (OEWS, May 2025) puts restaurant cooks at a mean of $18.62 an hour, with the 75th percentile at $21.45, and food servers outside restaurants at $17.37, with the 75th percentile at $18.51. Check your city before you set rates.</w:t>
+        <w:t>Everyone but the owner is a W-2 employee. Event staff work under our direction, on our schedule and with our equipment, which is the profile the Fair Labor Standards Act treats as employment, and California's AB5 presumes it. Calling them contractors may look cheaper, but misclassification can bring back taxes, penalties and claims, and it can sink a loan application. Payroll taxes add 10% to wages in the model, workers' compensation is required in nearly every state (Texas is the exception: coverage is optional there, but venues and lenders often ask for it), and you pay at least the highest of the federal, state and local minimum wage; the workbook uses the federal floor of $15,080 for full-time work as its reference, and many states are higher. For wages, the Bureau of Labor Statistics (OEWS, May 2025) puts restaurant cooks at a mean of $18.62 an hour, with the 75th percentile at $21.45, and food servers outside restaurants at $17.37, with the 75th percentile at $18.51. Check your city before you set rates.</w:t>
       </w:r>
     </w:p>
     <w:p>
@@ -639,7 +639,7 @@
     </w:p>
     <w:p>
       <w:r>
-        <w:t>The investment is built from lines you can price today. The largest are the smoker trailer ($20,000) and the used cargo van ($18,000), followed by the holding and service equipment ($6,500), the live-fire rig ($4,500), the trailer upfit ($3,500), the van upfit ($3,000), the website, photos and first bridal show ($5,000), first-year permits and certifications ($2,500) and the opening inventory ($4,000). Startup costs also include a 10% contingency on the trailer, the van and their upfits, and they add up to $83,300. On top we set aside working capital of $52,371, which covers the first months while payments come in, for a total investment of $135,671. The cash needed at opening is $135,671, funded with $35,000 of owner equity and a $101,000 loan at 10.0% over 7 years, with an annual payment of $20,746. A loan of that size means a bank loan or an SBA 7(a) loan, not a Microloan. The plan is lender-ready, but approval is not guaranteed: the terms are an illustration, not an offer, so get quotes for the trailer and the van before you treat any figure as closed.</w:t>
+        <w:t>The investment is built from lines you can price today. The largest are the smoker trailer ($20,000) and the used cargo van ($18,000), followed by the holding and service equipment ($6,500), the live-fire rig ($4,500), the trailer upfit ($3,500), the van upfit ($3,000), the website, photos and first bridal show ($5,000), first-year permits and certifications ($2,500) and the opening inventory ($4,000). Startup costs also include a 10% contingency on the trailer, the van and their upfits, and they add up to $83,300. On top we set aside working capital of $52,371, which covers the first months while payments come in, for a total investment of $135,671. It is funded with $35,000 of owner equity and a $101,000 loan at 10.0% over 7 years, with an annual payment of $20,746. A loan of that size means a bank loan or an SBA 7(a) loan, not a Microloan. The plan is lender-ready, but approval is not guaranteed: the terms are an illustration, not an offer, so get quotes for the trailer and the van before you treat any figure as closed.</w:t>
       </w:r>
     </w:p>
     <w:p>
@@ -649,7 +649,7 @@
     </w:p>
     <w:p>
       <w:r>
-        <w:t>The cost structure can be checked against reference ranges. Food cost on BBQ package sales is 28%, and all goods together are 28.8% of sales. Disposables, wood and cooking fuel add 4%, because the post oak, charcoal, pellets and propane backup grow with the pounds of meat you cook. Labor is 32.7% of sales, and the commissary and trailer parking are 5.1%, or $21,600 a year. Marketing is $10,000 a year, insurance is $6,000 and year-1 interest is $10,100. For reference, catering food cost typically runs from 28% to 35% of sales according to Galley Solutions, and net margins from 7% to 8% according to ItsaCheckmate. If your food cost sits above that range, check your yield and your portions first.</w:t>
+        <w:t>The cost structure can be checked against reference ranges. Food cost on BBQ package sales is 28%, and all goods together are 28.8% of sales. Disposables, wood and cooking fuel add 3.5%, because the post oak, charcoal, pellets and propane backup grow with the pounds of meat you cook. Labor is 32.7% of sales, and the commissary and trailer parking are 5.1%, or $21,600 a year. Marketing is $10,000 a year, insurance is $6,000 and year-1 interest is $10,100. For reference, catering food cost typically runs from 28% to 35% of sales according to Galley Solutions, and net margins from 7% to 8% according to ItsaCheckmate. If your food cost sits above that range, check your yield and your portions first.</w:t>
       </w:r>
     </w:p>
     <w:p>
@@ -686,7 +686,7 @@
     </w:p>
     <w:p>
       <w:r>
-        <w:t>You cannot run a BBQ catering business from your home kitchen. The FDA Food Code (section 3-201.11) requires food to come from sources that comply with the law and says that food prepared in a private home may not be used. Cottage food laws do not rescue you: in Texas, the state health department excludes meat, meat products and poultry. California ties catering to a permitted kitchen and does not allow it under its home-kitchen program. That is why this plan smokes in a permitted commissary and signs a written commissary agreement, and why that agreement comes before your business license. This section is general information, not legal advice.</w:t>
+        <w:t>You cannot run a BBQ catering business from your home kitchen. The FDA Food Code (section 3-201.11) requires food to come from sources that comply with the law and says that food prepared in a private home may not be used. Cottage food laws do not rescue you: in Texas, the state health department excludes meat, meat products and poultry. California ties catering to a permitted kitchen and does not allow it under its home-kitchen program. That is why this plan smokes in a permitted commissary and signs a written commissary agreement, and why that agreement comes before your health permit. This section is general information, not legal advice.</w:t>
       </w:r>
     </w:p>
     <w:p>
@@ -696,7 +696,7 @@
     </w:p>
     <w:p>
       <w:r>
-        <w:t>The permit question gets harder when the smoker trailer cooks at the event. In Texas, a mobile food unit must operate from a central preparation facility or another fixed food establishment, with daily logs, a hand sink, potable water and a certified food manager (25 TAC section 228.221). Florida and North Carolina ask for something similar, and we have not verified California. So ask your county whether smoking or serving from the trailer at the event turns it into a mobile food unit, and which permit that takes. If you cannot get one, smoke in the commissary and bring the meat in hot boxes. Public or community events usually need a temporary food establishment permit, and venues often ask for a certificate of insurance, sometimes naming them as additional insured.</w:t>
+        <w:t>The permit question gets harder when the smoker trailer cooks at the event. In Texas, a mobile food unit must operate from a central preparation facility or another fixed food establishment and report to it daily for supplies, cleaning and servicing, with a hand sink and potable water, and it needs a Certified Food Protection Manager certificate for its permit (25 TAC section 228.221). Florida and North Carolina ask for something similar, and we have not verified California. So ask your county whether smoking or serving from the trailer at the event turns it into a mobile food unit, and which permit that takes. If you cannot get one, smoke in the commissary and bring the meat in hot boxes. Public or community events usually need a temporary food establishment permit, and venues often ask for a certificate of insurance, sometimes naming them as additional insured.</w:t>
       </w:r>
     </w:p>
     <w:p>
@@ -711,12 +711,12 @@
     </w:p>
     <w:p>
       <w:r>
-        <w:t>Hiring and insurance come next. Event staff, the pit cook and the prep cook belong on W-2 payroll with workers' compensation, Form I-9, Form W-4 and your state's new-hire reporting. The FLSA treats servers and carvers as employees in almost every case, and California's AB5 presumes it, so a 1099 is a risk. The example budgets $6,000 a year for general liability or a business owner's policy, commercial auto that covers the trailer, workers' compensation and inland marine for the smoker and the equipment in transit. Insureon publishes average prices by policy, so get quotes from an agent who knows caterers, and ask venues for the certificate of insurance and additional insured wording they require before you quote.</w:t>
+        <w:t>Hiring and insurance come next. Event staff, the pit cook and the prep cook belong on W-2 payroll with workers' compensation (optional only in Texas, where venues and lenders still ask for it), Form I-9, Form W-4 and your state's new-hire reporting. The FLSA treats servers and carvers as employees in almost every case, and California's AB5 presumes it, so a 1099 is a risk. The example budgets $6,000 a year for general liability or a business owner's policy, commercial auto that covers the trailer, workers' compensation and inland marine for the smoker and the equipment in transit. Insureon publishes average prices by policy, so get quotes from an agent who knows caterers, and ask venues for the certificate of insurance and additional insured wording they require before you quote.</w:t>
       </w:r>
     </w:p>
     <w:p>
       <w:r>
-        <w:t>The last link is the road. The smoker trailer and the van are titled and registered with your state DMV, and trailer rules vary by state, so ask. Your auto policy has to cover commercial use and the trailer. A commercial driver's license is only required at a gross vehicle weight rating of 26,001 lb or more, which a cargo van does not reach. If you operate in the UK, the rules differ: register your food business with the local council at least 28 days before you start trading, even from a mobile unit or temporary premises, expect a Food Hygiene Rating from 0 to 5 (the FHIS in Scotland), keep a HACCP-based plan, declare the 14 listed allergens, charge VAT at 20% on event catering, and agree the event permit and the fire plan with the council and the venue.</w:t>
+        <w:t>The last link is the road. The smoker trailer and the van are titled and registered with your state DMV, and trailer rules vary by state, so ask. Your auto policy has to cover commercial use and the trailer. Federal rules require a commercial driver's license only at 26,001 lb or more (for a pickup and trailer, a combined rating of 26,001 lb or more with a trailer rated over 10,000 lb), which a cargo van or a pickup towing a smoker trailer does not usually reach. If you tow across state lines and the pickup and trailer are rated over 10,000 lb combined, federal motor carrier rules (a USDOT number and a DOT medical card) may apply: check with FMCSA and your state. If you operate in the UK, the rules differ: register your food business with the local council at least 28 days before you start trading, even from a mobile unit or temporary premises, expect a Food Hygiene Rating from 0 to 5 (the FHIS in Scotland), keep a HACCP-based plan, declare the 14 listed allergens, charge VAT at 20% on event catering once you are VAT-registered, and agree the event permit and the fire plan with the council and the venue.</w:t>
       </w:r>
     </w:p>
     <w:p>
@@ -753,7 +753,7 @@
     </w:p>
     <w:p>
       <w:r>
-        <w:t>The roadmap follows the six phases of the startup checklist that comes with the kit. "Phase 1 - Business Setup" covers the LLC, the tax registrations, the bank account and the conversation with your lender. "Phase 2 - Pits, Fire &amp; Permits" covers the commissary agreement, the health permit, the food safety plan, the fire rules, the propane backup and the insurance. "Phase 3 - Equipment" covers the smoker trailer, the van, the holding equipment and the supplier network. "Phase 4 - Staff" covers W-2 hiring, schedules and training. "Phase 5 - Marketing" builds the website, the Google Business Profile, the directory listings, the venue and planner outreach and the first tastings. "Phase 6 - First 90 Days" runs the first events and reviews each one against the plan. Do not move to the next phase while the permits of the current one are still open.</w:t>
+        <w:t>The roadmap follows the six phases of the startup checklist that comes with the kit. "Phase 1 - Business Setup" covers the LLC, the tax registrations, the bank account, the loan application, your contract and your food safety plan. "Phase 2 - Pits, Fire &amp; Permits" covers the commissary agreement, the health permit, the fire rules, the smoker trailer and the van, and the insurance. "Phase 3 - Equipment" covers the holding and carving gear, the live-fire rig and propane backup, the meat and wood suppliers and a full test cook. "Phase 4 - Staff" covers W-2 hiring, payroll and training. "Phase 5 - Marketing" builds the website, the Google Business Profile, the directory listings, the venue and planner outreach and the first tastings. "Phase 6 - First 90 Days" runs the first events and reviews each one against the plan. The phases overlap week by week, but do not book a paid event while any permit is still open.</w:t>
       </w:r>
     </w:p>
     <w:p>

</xml_diff>